<commit_message>
Update dependencies and refactor code formatting
- Upgraded `asciidoc.version` to 3.9 in `pom.xml`.
- Refactored `DefaultTests` for improved table handling in form control tests.
- Simplified code formatting and removed redundant comments in `DocxIterator`.
- Added handling for `CTSdtCell` in `DocxIterator` processing logic.
</commit_message>
<xml_diff>
--- a/src/test/resources/form-controls.docx
+++ b/src/test/resources/form-controls.docx
@@ -1,6 +1,6 @@
 
 <file path=word/document.xml><?xml version="1.0" encoding="utf-8"?>
-<w:document xmlns:wpc="http://schemas.microsoft.com/office/word/2010/wordprocessingCanvas" xmlns:cx="http://schemas.microsoft.com/office/drawing/2014/chartex" xmlns:cx1="http://schemas.microsoft.com/office/drawing/2015/9/8/chartex" xmlns:cx2="http://schemas.microsoft.com/office/drawing/2015/10/21/chartex" xmlns:cx3="http://schemas.microsoft.com/office/drawing/2016/5/9/chartex" xmlns:cx4="http://schemas.microsoft.com/office/drawing/2016/5/10/chartex" xmlns:cx5="http://schemas.microsoft.com/office/drawing/2016/5/11/chartex" xmlns:cx6="http://schemas.microsoft.com/office/drawing/2016/5/12/chartex" xmlns:cx7="http://schemas.microsoft.com/office/drawing/2016/5/13/chartex" xmlns:cx8="http://schemas.microsoft.com/office/drawing/2016/5/14/chartex" xmlns:mc="http://schemas.openxmlformats.org/markup-compatibility/2006" xmlns:aink="http://schemas.microsoft.com/office/drawing/2016/ink" xmlns:am3d="http://schemas.microsoft.com/office/drawing/2017/model3d" xmlns:o="urn:schemas-microsoft-com:office:office" xmlns:oel="http://schemas.microsoft.com/office/2019/extlst" xmlns:r="http://schemas.openxmlformats.org/officeDocument/2006/relationships" xmlns:m="http://schemas.openxmlformats.org/officeDocument/2006/math" xmlns:v="urn:schemas-microsoft-com:vml" xmlns:wp14="http://schemas.microsoft.com/office/word/2010/wordprocessingDrawing" xmlns:wp="http://schemas.openxmlformats.org/drawingml/2006/wordprocessingDrawing" xmlns:w10="urn:schemas-microsoft-com:office:word" xmlns:w="http://schemas.openxmlformats.org/wordprocessingml/2006/main" xmlns:w14="http://schemas.microsoft.com/office/word/2010/wordml" xmlns:w15="http://schemas.microsoft.com/office/word/2012/wordml" xmlns:w16cex="http://schemas.microsoft.com/office/word/2018/wordml/cex" xmlns:w16cid="http://schemas.microsoft.com/office/word/2016/wordml/cid" xmlns:w16="http://schemas.microsoft.com/office/word/2018/wordml" xmlns:w16du="http://schemas.microsoft.com/office/word/2023/wordml/word16du" xmlns:w16sdtdh="http://schemas.microsoft.com/office/word/2020/wordml/sdtdatahash" xmlns:w16se="http://schemas.microsoft.com/office/word/2015/wordml/symex" xmlns:wpg="http://schemas.microsoft.com/office/word/2010/wordprocessingGroup" xmlns:wpi="http://schemas.microsoft.com/office/word/2010/wordprocessingInk" xmlns:wne="http://schemas.microsoft.com/office/word/2006/wordml" xmlns:wps="http://schemas.microsoft.com/office/word/2010/wordprocessingShape" mc:Ignorable="w14 w15 w16se w16cid w16 w16cex w16sdtdh w16du wp14">
+<w:document xmlns:wpc="http://schemas.microsoft.com/office/word/2010/wordprocessingCanvas" xmlns:cx="http://schemas.microsoft.com/office/drawing/2014/chartex" xmlns:cx1="http://schemas.microsoft.com/office/drawing/2015/9/8/chartex" xmlns:cx2="http://schemas.microsoft.com/office/drawing/2015/10/21/chartex" xmlns:cx3="http://schemas.microsoft.com/office/drawing/2016/5/9/chartex" xmlns:cx4="http://schemas.microsoft.com/office/drawing/2016/5/10/chartex" xmlns:cx5="http://schemas.microsoft.com/office/drawing/2016/5/11/chartex" xmlns:cx6="http://schemas.microsoft.com/office/drawing/2016/5/12/chartex" xmlns:cx7="http://schemas.microsoft.com/office/drawing/2016/5/13/chartex" xmlns:cx8="http://schemas.microsoft.com/office/drawing/2016/5/14/chartex" xmlns:mc="http://schemas.openxmlformats.org/markup-compatibility/2006" xmlns:aink="http://schemas.microsoft.com/office/drawing/2016/ink" xmlns:am3d="http://schemas.microsoft.com/office/drawing/2017/model3d" xmlns:o="urn:schemas-microsoft-com:office:office" xmlns:oel="http://schemas.microsoft.com/office/2019/extlst" xmlns:r="http://schemas.openxmlformats.org/officeDocument/2006/relationships" xmlns:m="http://schemas.openxmlformats.org/officeDocument/2006/math" xmlns:v="urn:schemas-microsoft-com:vml" xmlns:wp14="http://schemas.microsoft.com/office/word/2010/wordprocessingDrawing" xmlns:wp="http://schemas.openxmlformats.org/drawingml/2006/wordprocessingDrawing" xmlns:w10="urn:schemas-microsoft-com:office:word" xmlns:w="http://schemas.openxmlformats.org/wordprocessingml/2006/main" xmlns:w14="http://schemas.microsoft.com/office/word/2010/wordml" xmlns:w15="http://schemas.microsoft.com/office/word/2012/wordml" xmlns:w16cex="http://schemas.microsoft.com/office/word/2018/wordml/cex" xmlns:w16cid="http://schemas.microsoft.com/office/word/2016/wordml/cid" xmlns:w16="http://schemas.microsoft.com/office/word/2018/wordml" xmlns:w16du="http://schemas.microsoft.com/office/word/2023/wordml/word16du" xmlns:w16sdtdh="http://schemas.microsoft.com/office/word/2020/wordml/sdtdatahash" xmlns:w16sdtfl="http://schemas.microsoft.com/office/word/2024/wordml/sdtformatlock" xmlns:w16se="http://schemas.microsoft.com/office/word/2015/wordml/symex" xmlns:wpg="http://schemas.microsoft.com/office/word/2010/wordprocessingGroup" xmlns:wpi="http://schemas.microsoft.com/office/word/2010/wordprocessingInk" xmlns:wne="http://schemas.microsoft.com/office/word/2006/wordml" xmlns:wps="http://schemas.microsoft.com/office/word/2010/wordprocessingShape" mc:Ignorable="w14 w15 w16se w16cid w16 w16cex w16sdtdh w16sdtfl w16du wp14">
   <w:body>
     <w:p>
       <w:pPr>
@@ -183,19 +183,252 @@
       <w:sdtContent>
         <w:p>
           <w:r>
-            <w:t>${</w:t>
-          </w:r>
-          <w:proofErr w:type="spellStart"/>
-          <w:r>
-            <w:t>name</w:t>
-          </w:r>
-          <w:proofErr w:type="spellEnd"/>
-          <w:r>
-            <w:t>}</w:t>
+            <w:t>${name}</w:t>
           </w:r>
         </w:p>
       </w:sdtContent>
     </w:sdt>
+    <w:p>
+      <w:r>
+        <w:t xml:space="preserve">In a </w:t>
+      </w:r>
+      <w:proofErr w:type="gramStart"/>
+      <w:r>
+        <w:t>table:</w:t>
+      </w:r>
+      <w:proofErr w:type="gramEnd"/>
+    </w:p>
+    <w:tbl>
+      <w:tblPr>
+        <w:tblStyle w:val="Grilledutableau"/>
+        <w:tblW w:w="0" w:type="auto"/>
+        <w:tblCellMar>
+          <w:top w:w="57" w:type="dxa"/>
+          <w:left w:w="57" w:type="dxa"/>
+          <w:bottom w:w="57" w:type="dxa"/>
+          <w:right w:w="57" w:type="dxa"/>
+        </w:tblCellMar>
+        <w:tblLook w:val="04A0" w:firstRow="1" w:lastRow="0" w:firstColumn="1" w:lastColumn="0" w:noHBand="0" w:noVBand="1"/>
+      </w:tblPr>
+      <w:tblGrid>
+        <w:gridCol w:w="9060"/>
+      </w:tblGrid>
+      <w:tr>
+        <w:sdt>
+          <w:sdtPr>
+            <w:id w:val="-704871874"/>
+            <w:placeholder>
+              <w:docPart w:val="C7567352575E4437A2FF5B6142DA3591"/>
+            </w:placeholder>
+            <w:text/>
+          </w:sdtPr>
+          <w:sdtContent>
+            <w:tc>
+              <w:tcPr>
+                <w:tcW w:w="9060" w:type="dxa"/>
+                <w:tcBorders>
+                  <w:top w:val="single" w:sz="4" w:space="0" w:color="auto"/>
+                  <w:left w:val="single" w:sz="4" w:space="0" w:color="auto"/>
+                  <w:bottom w:val="single" w:sz="4" w:space="0" w:color="auto"/>
+                  <w:right w:val="single" w:sz="4" w:space="0" w:color="auto"/>
+                </w:tcBorders>
+                <w:hideMark/>
+              </w:tcPr>
+              <w:p>
+                <w:pPr>
+                  <w:spacing w:after="160" w:line="278" w:lineRule="auto"/>
+                </w:pPr>
+                <w:r>
+                  <w:t>${</w:t>
+                </w:r>
+                <w:proofErr w:type="spellStart"/>
+                <w:r>
+                  <w:t>name</w:t>
+                </w:r>
+                <w:proofErr w:type="spellEnd"/>
+                <w:r>
+                  <w:t>}</w:t>
+                </w:r>
+              </w:p>
+            </w:tc>
+          </w:sdtContent>
+        </w:sdt>
+      </w:tr>
+    </w:tbl>
+    <w:p/>
+    <w:p>
+      <w:r>
+        <w:t xml:space="preserve">In </w:t>
+      </w:r>
+      <w:proofErr w:type="spellStart"/>
+      <w:r>
+        <w:t>another</w:t>
+      </w:r>
+      <w:proofErr w:type="spellEnd"/>
+      <w:r>
+        <w:t xml:space="preserve"> </w:t>
+      </w:r>
+      <w:proofErr w:type="gramStart"/>
+      <w:r>
+        <w:t>table:</w:t>
+      </w:r>
+      <w:proofErr w:type="gramEnd"/>
+    </w:p>
+    <w:tbl>
+      <w:tblPr>
+        <w:tblStyle w:val="Grilledutableau"/>
+        <w:tblW w:w="0" w:type="auto"/>
+        <w:tblCellMar>
+          <w:top w:w="57" w:type="dxa"/>
+          <w:left w:w="57" w:type="dxa"/>
+          <w:bottom w:w="57" w:type="dxa"/>
+          <w:right w:w="57" w:type="dxa"/>
+        </w:tblCellMar>
+        <w:tblLook w:val="04A0" w:firstRow="1" w:lastRow="0" w:firstColumn="1" w:lastColumn="0" w:noHBand="0" w:noVBand="1"/>
+      </w:tblPr>
+      <w:tblGrid>
+        <w:gridCol w:w="9060"/>
+      </w:tblGrid>
+      <w:tr>
+        <w:tc>
+          <w:tcPr>
+            <w:tcW w:w="9060" w:type="dxa"/>
+            <w:tcBorders>
+              <w:top w:val="single" w:sz="4" w:space="0" w:color="auto"/>
+              <w:left w:val="single" w:sz="4" w:space="0" w:color="auto"/>
+              <w:bottom w:val="single" w:sz="4" w:space="0" w:color="auto"/>
+              <w:right w:val="single" w:sz="4" w:space="0" w:color="auto"/>
+            </w:tcBorders>
+            <w:hideMark/>
+          </w:tcPr>
+          <w:p>
+            <w:r>
+              <w:t xml:space="preserve">Raw </w:t>
+            </w:r>
+            <w:proofErr w:type="spellStart"/>
+            <w:r>
+              <w:t>text</w:t>
+            </w:r>
+            <w:proofErr w:type="spellEnd"/>
+            <w:r>
+              <w:t xml:space="preserve"> control </w:t>
+            </w:r>
+            <w:proofErr w:type="spellStart"/>
+            <w:r>
+              <w:t>inlined</w:t>
+            </w:r>
+            <w:proofErr w:type="spellEnd"/>
+            <w:r>
+              <w:t xml:space="preserve"> </w:t>
+            </w:r>
+            <w:sdt>
+              <w:sdtPr>
+                <w:id w:val="-970972526"/>
+                <w:placeholder>
+                  <w:docPart w:val="8B4D50695A244D9183DD3067250B2ACA"/>
+                </w:placeholder>
+                <w:text/>
+              </w:sdtPr>
+              <w:sdtContent>
+                <w:r>
+                  <w:t>${</w:t>
+                </w:r>
+                <w:proofErr w:type="spellStart"/>
+                <w:r>
+                  <w:t>name</w:t>
+                </w:r>
+                <w:proofErr w:type="spellEnd"/>
+                <w:r>
+                  <w:t>}</w:t>
+                </w:r>
+              </w:sdtContent>
+            </w:sdt>
+          </w:p>
+        </w:tc>
+      </w:tr>
+    </w:tbl>
+    <w:p/>
+    <w:p>
+      <w:r>
+        <w:t xml:space="preserve">In </w:t>
+      </w:r>
+      <w:proofErr w:type="spellStart"/>
+      <w:r>
+        <w:t>another</w:t>
+      </w:r>
+      <w:proofErr w:type="spellEnd"/>
+      <w:r>
+        <w:t xml:space="preserve"> </w:t>
+      </w:r>
+      <w:proofErr w:type="gramStart"/>
+      <w:r>
+        <w:t>table:</w:t>
+      </w:r>
+      <w:proofErr w:type="gramEnd"/>
+    </w:p>
+    <w:tbl>
+      <w:tblPr>
+        <w:tblStyle w:val="Grilledutableau"/>
+        <w:tblW w:w="0" w:type="auto"/>
+        <w:tblCellMar>
+          <w:top w:w="57" w:type="dxa"/>
+          <w:left w:w="57" w:type="dxa"/>
+          <w:bottom w:w="57" w:type="dxa"/>
+          <w:right w:w="57" w:type="dxa"/>
+        </w:tblCellMar>
+        <w:tblLook w:val="04A0" w:firstRow="1" w:lastRow="0" w:firstColumn="1" w:lastColumn="0" w:noHBand="0" w:noVBand="1"/>
+      </w:tblPr>
+      <w:tblGrid>
+        <w:gridCol w:w="9060"/>
+      </w:tblGrid>
+      <w:tr>
+        <w:tc>
+          <w:tcPr>
+            <w:tcW w:w="9060" w:type="dxa"/>
+            <w:tcBorders>
+              <w:top w:val="single" w:sz="4" w:space="0" w:color="auto"/>
+              <w:left w:val="single" w:sz="4" w:space="0" w:color="auto"/>
+              <w:bottom w:val="single" w:sz="4" w:space="0" w:color="auto"/>
+              <w:right w:val="single" w:sz="4" w:space="0" w:color="auto"/>
+            </w:tcBorders>
+            <w:hideMark/>
+          </w:tcPr>
+          <w:sdt>
+            <w:sdtPr>
+              <w:id w:val="1639454648"/>
+              <w:placeholder>
+                <w:docPart w:val="F3E304A877BD4EF5BE2C886476DB4189"/>
+              </w:placeholder>
+              <w:text/>
+            </w:sdtPr>
+            <w:sdtContent>
+              <w:p>
+                <w:r>
+                  <w:t xml:space="preserve">Raw </w:t>
+                </w:r>
+                <w:proofErr w:type="spellStart"/>
+                <w:r>
+                  <w:t>text</w:t>
+                </w:r>
+                <w:proofErr w:type="spellEnd"/>
+                <w:r>
+                  <w:t xml:space="preserve"> control line ${</w:t>
+                </w:r>
+                <w:proofErr w:type="spellStart"/>
+                <w:r>
+                  <w:t>name</w:t>
+                </w:r>
+                <w:proofErr w:type="spellEnd"/>
+                <w:r>
+                  <w:t>}</w:t>
+                </w:r>
+              </w:p>
+            </w:sdtContent>
+          </w:sdt>
+        </w:tc>
+      </w:tr>
+    </w:tbl>
+    <w:p/>
     <w:p/>
     <w:sectPr>
       <w:pgSz w:w="11906" w:h="16838"/>
@@ -207,8 +440,58 @@
 </w:document>
 </file>
 
+<file path=word/endnotes.xml><?xml version="1.0" encoding="utf-8"?>
+<w:endnotes xmlns:wpc="http://schemas.microsoft.com/office/word/2010/wordprocessingCanvas" xmlns:cx="http://schemas.microsoft.com/office/drawing/2014/chartex" xmlns:cx1="http://schemas.microsoft.com/office/drawing/2015/9/8/chartex" xmlns:cx2="http://schemas.microsoft.com/office/drawing/2015/10/21/chartex" xmlns:cx3="http://schemas.microsoft.com/office/drawing/2016/5/9/chartex" xmlns:cx4="http://schemas.microsoft.com/office/drawing/2016/5/10/chartex" xmlns:cx5="http://schemas.microsoft.com/office/drawing/2016/5/11/chartex" xmlns:cx6="http://schemas.microsoft.com/office/drawing/2016/5/12/chartex" xmlns:cx7="http://schemas.microsoft.com/office/drawing/2016/5/13/chartex" xmlns:cx8="http://schemas.microsoft.com/office/drawing/2016/5/14/chartex" xmlns:mc="http://schemas.openxmlformats.org/markup-compatibility/2006" xmlns:aink="http://schemas.microsoft.com/office/drawing/2016/ink" xmlns:am3d="http://schemas.microsoft.com/office/drawing/2017/model3d" xmlns:o="urn:schemas-microsoft-com:office:office" xmlns:oel="http://schemas.microsoft.com/office/2019/extlst" xmlns:r="http://schemas.openxmlformats.org/officeDocument/2006/relationships" xmlns:m="http://schemas.openxmlformats.org/officeDocument/2006/math" xmlns:v="urn:schemas-microsoft-com:vml" xmlns:wp14="http://schemas.microsoft.com/office/word/2010/wordprocessingDrawing" xmlns:wp="http://schemas.openxmlformats.org/drawingml/2006/wordprocessingDrawing" xmlns:w10="urn:schemas-microsoft-com:office:word" xmlns:w="http://schemas.openxmlformats.org/wordprocessingml/2006/main" xmlns:w14="http://schemas.microsoft.com/office/word/2010/wordml" xmlns:w15="http://schemas.microsoft.com/office/word/2012/wordml" xmlns:w16cex="http://schemas.microsoft.com/office/word/2018/wordml/cex" xmlns:w16cid="http://schemas.microsoft.com/office/word/2016/wordml/cid" xmlns:w16="http://schemas.microsoft.com/office/word/2018/wordml" xmlns:w16du="http://schemas.microsoft.com/office/word/2023/wordml/word16du" xmlns:w16sdtdh="http://schemas.microsoft.com/office/word/2020/wordml/sdtdatahash" xmlns:w16sdtfl="http://schemas.microsoft.com/office/word/2024/wordml/sdtformatlock" xmlns:w16se="http://schemas.microsoft.com/office/word/2015/wordml/symex" xmlns:wpg="http://schemas.microsoft.com/office/word/2010/wordprocessingGroup" xmlns:wpi="http://schemas.microsoft.com/office/word/2010/wordprocessingInk" xmlns:wne="http://schemas.microsoft.com/office/word/2006/wordml" xmlns:wps="http://schemas.microsoft.com/office/word/2010/wordprocessingShape" mc:Ignorable="w14 w15 w16se w16cid w16 w16cex w16sdtdh w16sdtfl w16du wp14">
+  <w:endnote w:type="separator" w:id="-1">
+    <w:p>
+      <w:pPr>
+        <w:spacing w:after="0" w:line="240" w:lineRule="auto"/>
+      </w:pPr>
+      <w:r>
+        <w:separator/>
+      </w:r>
+    </w:p>
+  </w:endnote>
+  <w:endnote w:type="continuationSeparator" w:id="0">
+    <w:p>
+      <w:pPr>
+        <w:spacing w:after="0" w:line="240" w:lineRule="auto"/>
+      </w:pPr>
+      <w:r>
+        <w:continuationSeparator/>
+      </w:r>
+    </w:p>
+  </w:endnote>
+</w:endnotes>
+</file>
+
+<file path=word/footnotes.xml><?xml version="1.0" encoding="utf-8"?>
+<w:footnotes xmlns:wpc="http://schemas.microsoft.com/office/word/2010/wordprocessingCanvas" xmlns:cx="http://schemas.microsoft.com/office/drawing/2014/chartex" xmlns:cx1="http://schemas.microsoft.com/office/drawing/2015/9/8/chartex" xmlns:cx2="http://schemas.microsoft.com/office/drawing/2015/10/21/chartex" xmlns:cx3="http://schemas.microsoft.com/office/drawing/2016/5/9/chartex" xmlns:cx4="http://schemas.microsoft.com/office/drawing/2016/5/10/chartex" xmlns:cx5="http://schemas.microsoft.com/office/drawing/2016/5/11/chartex" xmlns:cx6="http://schemas.microsoft.com/office/drawing/2016/5/12/chartex" xmlns:cx7="http://schemas.microsoft.com/office/drawing/2016/5/13/chartex" xmlns:cx8="http://schemas.microsoft.com/office/drawing/2016/5/14/chartex" xmlns:mc="http://schemas.openxmlformats.org/markup-compatibility/2006" xmlns:aink="http://schemas.microsoft.com/office/drawing/2016/ink" xmlns:am3d="http://schemas.microsoft.com/office/drawing/2017/model3d" xmlns:o="urn:schemas-microsoft-com:office:office" xmlns:oel="http://schemas.microsoft.com/office/2019/extlst" xmlns:r="http://schemas.openxmlformats.org/officeDocument/2006/relationships" xmlns:m="http://schemas.openxmlformats.org/officeDocument/2006/math" xmlns:v="urn:schemas-microsoft-com:vml" xmlns:wp14="http://schemas.microsoft.com/office/word/2010/wordprocessingDrawing" xmlns:wp="http://schemas.openxmlformats.org/drawingml/2006/wordprocessingDrawing" xmlns:w10="urn:schemas-microsoft-com:office:word" xmlns:w="http://schemas.openxmlformats.org/wordprocessingml/2006/main" xmlns:w14="http://schemas.microsoft.com/office/word/2010/wordml" xmlns:w15="http://schemas.microsoft.com/office/word/2012/wordml" xmlns:w16cex="http://schemas.microsoft.com/office/word/2018/wordml/cex" xmlns:w16cid="http://schemas.microsoft.com/office/word/2016/wordml/cid" xmlns:w16="http://schemas.microsoft.com/office/word/2018/wordml" xmlns:w16du="http://schemas.microsoft.com/office/word/2023/wordml/word16du" xmlns:w16sdtdh="http://schemas.microsoft.com/office/word/2020/wordml/sdtdatahash" xmlns:w16sdtfl="http://schemas.microsoft.com/office/word/2024/wordml/sdtformatlock" xmlns:w16se="http://schemas.microsoft.com/office/word/2015/wordml/symex" xmlns:wpg="http://schemas.microsoft.com/office/word/2010/wordprocessingGroup" xmlns:wpi="http://schemas.microsoft.com/office/word/2010/wordprocessingInk" xmlns:wne="http://schemas.microsoft.com/office/word/2006/wordml" xmlns:wps="http://schemas.microsoft.com/office/word/2010/wordprocessingShape" mc:Ignorable="w14 w15 w16se w16cid w16 w16cex w16sdtdh w16sdtfl w16du wp14">
+  <w:footnote w:type="separator" w:id="-1">
+    <w:p>
+      <w:pPr>
+        <w:spacing w:after="0" w:line="240" w:lineRule="auto"/>
+      </w:pPr>
+      <w:r>
+        <w:separator/>
+      </w:r>
+    </w:p>
+  </w:footnote>
+  <w:footnote w:type="continuationSeparator" w:id="0">
+    <w:p>
+      <w:pPr>
+        <w:spacing w:after="0" w:line="240" w:lineRule="auto"/>
+      </w:pPr>
+      <w:r>
+        <w:continuationSeparator/>
+      </w:r>
+    </w:p>
+  </w:footnote>
+</w:footnotes>
+</file>
+
 <file path=word/styles.xml><?xml version="1.0" encoding="utf-8"?>
-<w:styles xmlns:mc="http://schemas.openxmlformats.org/markup-compatibility/2006" xmlns:r="http://schemas.openxmlformats.org/officeDocument/2006/relationships" xmlns:w="http://schemas.openxmlformats.org/wordprocessingml/2006/main" xmlns:w14="http://schemas.microsoft.com/office/word/2010/wordml" xmlns:w15="http://schemas.microsoft.com/office/word/2012/wordml" xmlns:w16cex="http://schemas.microsoft.com/office/word/2018/wordml/cex" xmlns:w16cid="http://schemas.microsoft.com/office/word/2016/wordml/cid" xmlns:w16="http://schemas.microsoft.com/office/word/2018/wordml" xmlns:w16du="http://schemas.microsoft.com/office/word/2023/wordml/word16du" xmlns:w16sdtdh="http://schemas.microsoft.com/office/word/2020/wordml/sdtdatahash" xmlns:w16se="http://schemas.microsoft.com/office/word/2015/wordml/symex" mc:Ignorable="w14 w15 w16se w16cid w16 w16cex w16sdtdh w16du">
+<w:styles xmlns:mc="http://schemas.openxmlformats.org/markup-compatibility/2006" xmlns:r="http://schemas.openxmlformats.org/officeDocument/2006/relationships" xmlns:w="http://schemas.openxmlformats.org/wordprocessingml/2006/main" xmlns:w14="http://schemas.microsoft.com/office/word/2010/wordml" xmlns:w15="http://schemas.microsoft.com/office/word/2012/wordml" xmlns:w16cex="http://schemas.microsoft.com/office/word/2018/wordml/cex" xmlns:w16cid="http://schemas.microsoft.com/office/word/2016/wordml/cid" xmlns:w16="http://schemas.microsoft.com/office/word/2018/wordml" xmlns:w16du="http://schemas.microsoft.com/office/word/2023/wordml/word16du" xmlns:w16sdtdh="http://schemas.microsoft.com/office/word/2020/wordml/sdtdatahash" xmlns:w16sdtfl="http://schemas.microsoft.com/office/word/2024/wordml/sdtformatlock" xmlns:w16se="http://schemas.microsoft.com/office/word/2015/wordml/symex" mc:Ignorable="w14 w15 w16se w16cid w16 w16cex w16sdtdh w16sdtfl w16du">
   <w:docDefaults>
     <w:rPrDefault>
       <w:rPr>
@@ -607,6 +890,7 @@
   <w:style w:type="paragraph" w:default="1" w:styleId="Normal">
     <w:name w:val="Normal"/>
     <w:qFormat/>
+    <w:rsid w:val="000B488F"/>
   </w:style>
   <w:style w:type="paragraph" w:styleId="Titre1">
     <w:name w:val="heading 1"/>
@@ -810,6 +1094,7 @@
   <w:style w:type="character" w:default="1" w:styleId="Policepardfaut">
     <w:name w:val="Default Paragraph Font"/>
     <w:uiPriority w:val="1"/>
+    <w:semiHidden/>
     <w:unhideWhenUsed/>
   </w:style>
   <w:style w:type="table" w:default="1" w:styleId="TableauNormal">
@@ -1133,11 +1418,74 @@
       <w:color w:val="666666"/>
     </w:rPr>
   </w:style>
+  <w:style w:type="paragraph" w:styleId="En-tte">
+    <w:name w:val="header"/>
+    <w:basedOn w:val="Normal"/>
+    <w:link w:val="En-tteCar"/>
+    <w:uiPriority w:val="99"/>
+    <w:unhideWhenUsed/>
+    <w:rsid w:val="007C3C0F"/>
+    <w:pPr>
+      <w:tabs>
+        <w:tab w:val="center" w:pos="4536"/>
+        <w:tab w:val="right" w:pos="9072"/>
+      </w:tabs>
+      <w:spacing w:after="0" w:line="240" w:lineRule="auto"/>
+    </w:pPr>
+  </w:style>
+  <w:style w:type="character" w:customStyle="1" w:styleId="En-tteCar">
+    <w:name w:val="En-tête Car"/>
+    <w:basedOn w:val="Policepardfaut"/>
+    <w:link w:val="En-tte"/>
+    <w:uiPriority w:val="99"/>
+    <w:rsid w:val="007C3C0F"/>
+  </w:style>
+  <w:style w:type="paragraph" w:styleId="Pieddepage">
+    <w:name w:val="footer"/>
+    <w:basedOn w:val="Normal"/>
+    <w:link w:val="PieddepageCar"/>
+    <w:uiPriority w:val="99"/>
+    <w:unhideWhenUsed/>
+    <w:rsid w:val="007C3C0F"/>
+    <w:pPr>
+      <w:tabs>
+        <w:tab w:val="center" w:pos="4536"/>
+        <w:tab w:val="right" w:pos="9072"/>
+      </w:tabs>
+      <w:spacing w:after="0" w:line="240" w:lineRule="auto"/>
+    </w:pPr>
+  </w:style>
+  <w:style w:type="character" w:customStyle="1" w:styleId="PieddepageCar">
+    <w:name w:val="Pied de page Car"/>
+    <w:basedOn w:val="Policepardfaut"/>
+    <w:link w:val="Pieddepage"/>
+    <w:uiPriority w:val="99"/>
+    <w:rsid w:val="007C3C0F"/>
+  </w:style>
+  <w:style w:type="table" w:styleId="Grilledutableau">
+    <w:name w:val="Table Grid"/>
+    <w:basedOn w:val="TableauNormal"/>
+    <w:uiPriority w:val="39"/>
+    <w:rsid w:val="007C3C0F"/>
+    <w:pPr>
+      <w:spacing w:after="0" w:line="240" w:lineRule="auto"/>
+    </w:pPr>
+    <w:tblPr>
+      <w:tblBorders>
+        <w:top w:val="single" w:sz="4" w:space="0" w:color="auto"/>
+        <w:left w:val="single" w:sz="4" w:space="0" w:color="auto"/>
+        <w:bottom w:val="single" w:sz="4" w:space="0" w:color="auto"/>
+        <w:right w:val="single" w:sz="4" w:space="0" w:color="auto"/>
+        <w:insideH w:val="single" w:sz="4" w:space="0" w:color="auto"/>
+        <w:insideV w:val="single" w:sz="4" w:space="0" w:color="auto"/>
+      </w:tblBorders>
+    </w:tblPr>
+  </w:style>
 </w:styles>
 </file>
 
 <file path=word/glossary/document.xml><?xml version="1.0" encoding="utf-8"?>
-<w:glossaryDocument xmlns:wpc="http://schemas.microsoft.com/office/word/2010/wordprocessingCanvas" xmlns:cx="http://schemas.microsoft.com/office/drawing/2014/chartex" xmlns:cx1="http://schemas.microsoft.com/office/drawing/2015/9/8/chartex" xmlns:cx2="http://schemas.microsoft.com/office/drawing/2015/10/21/chartex" xmlns:cx3="http://schemas.microsoft.com/office/drawing/2016/5/9/chartex" xmlns:cx4="http://schemas.microsoft.com/office/drawing/2016/5/10/chartex" xmlns:cx5="http://schemas.microsoft.com/office/drawing/2016/5/11/chartex" xmlns:cx6="http://schemas.microsoft.com/office/drawing/2016/5/12/chartex" xmlns:cx7="http://schemas.microsoft.com/office/drawing/2016/5/13/chartex" xmlns:cx8="http://schemas.microsoft.com/office/drawing/2016/5/14/chartex" xmlns:mc="http://schemas.openxmlformats.org/markup-compatibility/2006" xmlns:aink="http://schemas.microsoft.com/office/drawing/2016/ink" xmlns:am3d="http://schemas.microsoft.com/office/drawing/2017/model3d" xmlns:o="urn:schemas-microsoft-com:office:office" xmlns:oel="http://schemas.microsoft.com/office/2019/extlst" xmlns:r="http://schemas.openxmlformats.org/officeDocument/2006/relationships" xmlns:m="http://schemas.openxmlformats.org/officeDocument/2006/math" xmlns:v="urn:schemas-microsoft-com:vml" xmlns:wp14="http://schemas.microsoft.com/office/word/2010/wordprocessingDrawing" xmlns:wp="http://schemas.openxmlformats.org/drawingml/2006/wordprocessingDrawing" xmlns:w10="urn:schemas-microsoft-com:office:word" xmlns:w="http://schemas.openxmlformats.org/wordprocessingml/2006/main" xmlns:w14="http://schemas.microsoft.com/office/word/2010/wordml" xmlns:w15="http://schemas.microsoft.com/office/word/2012/wordml" xmlns:w16cex="http://schemas.microsoft.com/office/word/2018/wordml/cex" xmlns:w16cid="http://schemas.microsoft.com/office/word/2016/wordml/cid" xmlns:w16="http://schemas.microsoft.com/office/word/2018/wordml" xmlns:w16du="http://schemas.microsoft.com/office/word/2023/wordml/word16du" xmlns:w16sdtdh="http://schemas.microsoft.com/office/word/2020/wordml/sdtdatahash" xmlns:w16se="http://schemas.microsoft.com/office/word/2015/wordml/symex" xmlns:wpg="http://schemas.microsoft.com/office/word/2010/wordprocessingGroup" xmlns:wpi="http://schemas.microsoft.com/office/word/2010/wordprocessingInk" xmlns:wne="http://schemas.microsoft.com/office/word/2006/wordml" xmlns:wps="http://schemas.microsoft.com/office/word/2010/wordprocessingShape" mc:Ignorable="w14 w15 w16se w16cid w16 w16cex w16sdtdh w16du wp14">
+<w:glossaryDocument xmlns:wpc="http://schemas.microsoft.com/office/word/2010/wordprocessingCanvas" xmlns:cx="http://schemas.microsoft.com/office/drawing/2014/chartex" xmlns:cx1="http://schemas.microsoft.com/office/drawing/2015/9/8/chartex" xmlns:cx2="http://schemas.microsoft.com/office/drawing/2015/10/21/chartex" xmlns:cx3="http://schemas.microsoft.com/office/drawing/2016/5/9/chartex" xmlns:cx4="http://schemas.microsoft.com/office/drawing/2016/5/10/chartex" xmlns:cx5="http://schemas.microsoft.com/office/drawing/2016/5/11/chartex" xmlns:cx6="http://schemas.microsoft.com/office/drawing/2016/5/12/chartex" xmlns:cx7="http://schemas.microsoft.com/office/drawing/2016/5/13/chartex" xmlns:cx8="http://schemas.microsoft.com/office/drawing/2016/5/14/chartex" xmlns:mc="http://schemas.openxmlformats.org/markup-compatibility/2006" xmlns:aink="http://schemas.microsoft.com/office/drawing/2016/ink" xmlns:am3d="http://schemas.microsoft.com/office/drawing/2017/model3d" xmlns:o="urn:schemas-microsoft-com:office:office" xmlns:oel="http://schemas.microsoft.com/office/2019/extlst" xmlns:r="http://schemas.openxmlformats.org/officeDocument/2006/relationships" xmlns:m="http://schemas.openxmlformats.org/officeDocument/2006/math" xmlns:v="urn:schemas-microsoft-com:vml" xmlns:wp14="http://schemas.microsoft.com/office/word/2010/wordprocessingDrawing" xmlns:wp="http://schemas.openxmlformats.org/drawingml/2006/wordprocessingDrawing" xmlns:w10="urn:schemas-microsoft-com:office:word" xmlns:w="http://schemas.openxmlformats.org/wordprocessingml/2006/main" xmlns:w14="http://schemas.microsoft.com/office/word/2010/wordml" xmlns:w15="http://schemas.microsoft.com/office/word/2012/wordml" xmlns:w16cex="http://schemas.microsoft.com/office/word/2018/wordml/cex" xmlns:w16cid="http://schemas.microsoft.com/office/word/2016/wordml/cid" xmlns:w16="http://schemas.microsoft.com/office/word/2018/wordml" xmlns:w16du="http://schemas.microsoft.com/office/word/2023/wordml/word16du" xmlns:w16sdtdh="http://schemas.microsoft.com/office/word/2020/wordml/sdtdatahash" xmlns:w16sdtfl="http://schemas.microsoft.com/office/word/2024/wordml/sdtformatlock" xmlns:w16se="http://schemas.microsoft.com/office/word/2015/wordml/symex" xmlns:wpg="http://schemas.microsoft.com/office/word/2010/wordprocessingGroup" xmlns:wpi="http://schemas.microsoft.com/office/word/2010/wordprocessingInk" xmlns:wne="http://schemas.microsoft.com/office/word/2006/wordml" xmlns:wps="http://schemas.microsoft.com/office/word/2010/wordprocessingShape" mc:Ignorable="w14 w15 w16se w16cid w16 w16cex w16sdtdh w16sdtfl w16du wp14">
   <w:docParts>
     <w:docPart>
       <w:docPartPr>
@@ -1186,10 +1534,94 @@
             <w:pStyle w:val="877DD4951D2744759FB675494371D3E6"/>
           </w:pPr>
           <w:r>
+            <w:t>${name}</w:t>
+          </w:r>
+        </w:p>
+      </w:docPartBody>
+    </w:docPart>
+    <w:docPart>
+      <w:docPartPr>
+        <w:name w:val="C7567352575E4437A2FF5B6142DA3591"/>
+        <w:category>
+          <w:name w:val="Général"/>
+          <w:gallery w:val="placeholder"/>
+        </w:category>
+        <w:types>
+          <w:type w:val="bbPlcHdr"/>
+        </w:types>
+        <w:behaviors>
+          <w:behavior w:val="content"/>
+        </w:behaviors>
+        <w:guid w:val="{BBD42C20-979B-4E42-94AA-699163F94048}"/>
+      </w:docPartPr>
+      <w:docPartBody>
+        <w:p>
+          <w:pPr>
+            <w:pStyle w:val="C7567352575E4437A2FF5B6142DA3591"/>
+          </w:pPr>
+          <w:r>
             <w:rPr>
               <w:rStyle w:val="Textedelespacerserv"/>
             </w:rPr>
-            <w:t>${name}</w:t>
+            <w:t>Click or tap here to enter text.</w:t>
+          </w:r>
+        </w:p>
+      </w:docPartBody>
+    </w:docPart>
+    <w:docPart>
+      <w:docPartPr>
+        <w:name w:val="8B4D50695A244D9183DD3067250B2ACA"/>
+        <w:category>
+          <w:name w:val="Général"/>
+          <w:gallery w:val="placeholder"/>
+        </w:category>
+        <w:types>
+          <w:type w:val="bbPlcHdr"/>
+        </w:types>
+        <w:behaviors>
+          <w:behavior w:val="content"/>
+        </w:behaviors>
+        <w:guid w:val="{14FD3DA2-ABDB-4595-97C6-2697EB93F411}"/>
+      </w:docPartPr>
+      <w:docPartBody>
+        <w:p>
+          <w:pPr>
+            <w:pStyle w:val="8B4D50695A244D9183DD3067250B2ACA"/>
+          </w:pPr>
+          <w:r>
+            <w:rPr>
+              <w:rStyle w:val="Textedelespacerserv"/>
+            </w:rPr>
+            <w:t>Click or tap here to enter text.</w:t>
+          </w:r>
+        </w:p>
+      </w:docPartBody>
+    </w:docPart>
+    <w:docPart>
+      <w:docPartPr>
+        <w:name w:val="F3E304A877BD4EF5BE2C886476DB4189"/>
+        <w:category>
+          <w:name w:val="Général"/>
+          <w:gallery w:val="placeholder"/>
+        </w:category>
+        <w:types>
+          <w:type w:val="bbPlcHdr"/>
+        </w:types>
+        <w:behaviors>
+          <w:behavior w:val="content"/>
+        </w:behaviors>
+        <w:guid w:val="{D17E5C06-4F53-47A8-A802-8D67EBE27026}"/>
+      </w:docPartPr>
+      <w:docPartBody>
+        <w:p>
+          <w:pPr>
+            <w:pStyle w:val="F3E304A877BD4EF5BE2C886476DB4189"/>
+          </w:pPr>
+          <w:r>
+            <w:rPr>
+              <w:rStyle w:val="Textedelespacerserv"/>
+            </w:rPr>
+            <w:t>Click or tap here to enter text.</w:t>
           </w:r>
         </w:p>
       </w:docPartBody>
@@ -1199,7 +1631,7 @@
 </file>
 
 <file path=word/glossary/fontTable.xml><?xml version="1.0" encoding="utf-8"?>
-<w:fonts xmlns:mc="http://schemas.openxmlformats.org/markup-compatibility/2006" xmlns:r="http://schemas.openxmlformats.org/officeDocument/2006/relationships" xmlns:w="http://schemas.openxmlformats.org/wordprocessingml/2006/main" xmlns:w14="http://schemas.microsoft.com/office/word/2010/wordml" xmlns:w15="http://schemas.microsoft.com/office/word/2012/wordml" xmlns:w16cex="http://schemas.microsoft.com/office/word/2018/wordml/cex" xmlns:w16cid="http://schemas.microsoft.com/office/word/2016/wordml/cid" xmlns:w16="http://schemas.microsoft.com/office/word/2018/wordml" xmlns:w16du="http://schemas.microsoft.com/office/word/2023/wordml/word16du" xmlns:w16sdtdh="http://schemas.microsoft.com/office/word/2020/wordml/sdtdatahash" xmlns:w16se="http://schemas.microsoft.com/office/word/2015/wordml/symex" mc:Ignorable="w14 w15 w16se w16cid w16 w16cex w16sdtdh w16du">
+<w:fonts xmlns:mc="http://schemas.openxmlformats.org/markup-compatibility/2006" xmlns:r="http://schemas.openxmlformats.org/officeDocument/2006/relationships" xmlns:w="http://schemas.openxmlformats.org/wordprocessingml/2006/main" xmlns:w14="http://schemas.microsoft.com/office/word/2010/wordml" xmlns:w15="http://schemas.microsoft.com/office/word/2012/wordml" xmlns:w16cex="http://schemas.microsoft.com/office/word/2018/wordml/cex" xmlns:w16cid="http://schemas.microsoft.com/office/word/2016/wordml/cid" xmlns:w16="http://schemas.microsoft.com/office/word/2018/wordml" xmlns:w16du="http://schemas.microsoft.com/office/word/2023/wordml/word16du" xmlns:w16sdtdh="http://schemas.microsoft.com/office/word/2020/wordml/sdtdatahash" xmlns:w16sdtfl="http://schemas.microsoft.com/office/word/2024/wordml/sdtformatlock" xmlns:w16se="http://schemas.microsoft.com/office/word/2015/wordml/symex" mc:Ignorable="w14 w15 w16se w16cid w16 w16cex w16sdtdh w16sdtfl w16du">
   <w:font w:name="Aptos">
     <w:charset w:val="00"/>
     <w:family w:val="swiss"/>
@@ -1246,8 +1678,9 @@
 </file>
 
 <file path=word/glossary/settings.xml><?xml version="1.0" encoding="utf-8"?>
-<w:settings xmlns:mc="http://schemas.openxmlformats.org/markup-compatibility/2006" xmlns:o="urn:schemas-microsoft-com:office:office" xmlns:r="http://schemas.openxmlformats.org/officeDocument/2006/relationships" xmlns:m="http://schemas.openxmlformats.org/officeDocument/2006/math" xmlns:v="urn:schemas-microsoft-com:vml" xmlns:w10="urn:schemas-microsoft-com:office:word" xmlns:w="http://schemas.openxmlformats.org/wordprocessingml/2006/main" xmlns:w14="http://schemas.microsoft.com/office/word/2010/wordml" xmlns:w15="http://schemas.microsoft.com/office/word/2012/wordml" xmlns:w16cex="http://schemas.microsoft.com/office/word/2018/wordml/cex" xmlns:w16cid="http://schemas.microsoft.com/office/word/2016/wordml/cid" xmlns:w16="http://schemas.microsoft.com/office/word/2018/wordml" xmlns:w16du="http://schemas.microsoft.com/office/word/2023/wordml/word16du" xmlns:w16sdtdh="http://schemas.microsoft.com/office/word/2020/wordml/sdtdatahash" xmlns:w16se="http://schemas.microsoft.com/office/word/2015/wordml/symex" xmlns:sl="http://schemas.openxmlformats.org/schemaLibrary/2006/main" mc:Ignorable="w14 w15 w16se w16cid w16 w16cex w16sdtdh w16du">
+<w:settings xmlns:mc="http://schemas.openxmlformats.org/markup-compatibility/2006" xmlns:o="urn:schemas-microsoft-com:office:office" xmlns:r="http://schemas.openxmlformats.org/officeDocument/2006/relationships" xmlns:m="http://schemas.openxmlformats.org/officeDocument/2006/math" xmlns:v="urn:schemas-microsoft-com:vml" xmlns:w10="urn:schemas-microsoft-com:office:word" xmlns:w="http://schemas.openxmlformats.org/wordprocessingml/2006/main" xmlns:w14="http://schemas.microsoft.com/office/word/2010/wordml" xmlns:w15="http://schemas.microsoft.com/office/word/2012/wordml" xmlns:w16cex="http://schemas.microsoft.com/office/word/2018/wordml/cex" xmlns:w16cid="http://schemas.microsoft.com/office/word/2016/wordml/cid" xmlns:w16="http://schemas.microsoft.com/office/word/2018/wordml" xmlns:w16du="http://schemas.microsoft.com/office/word/2023/wordml/word16du" xmlns:w16sdtdh="http://schemas.microsoft.com/office/word/2020/wordml/sdtdatahash" xmlns:w16sdtfl="http://schemas.microsoft.com/office/word/2024/wordml/sdtformatlock" xmlns:w16se="http://schemas.microsoft.com/office/word/2015/wordml/symex" xmlns:sl="http://schemas.openxmlformats.org/schemaLibrary/2006/main" mc:Ignorable="w14 w15 w16se w16cid w16 w16cex w16sdtdh w16sdtfl w16du">
   <w:view w:val="normal"/>
+  <w:revisionView w:inkAnnotations="0"/>
   <w:defaultTabStop w:val="720"/>
   <w:hyphenationZone w:val="425"/>
   <w:characterSpacingControl w:val="doNotCompress"/>
@@ -1269,13 +1702,22 @@
     <w:rsid w:val="00372649"/>
     <w:rsid w:val="003B37E2"/>
     <w:rsid w:val="00533144"/>
+    <w:rsid w:val="005933D7"/>
     <w:rsid w:val="006A09AD"/>
+    <w:rsid w:val="006C3F1D"/>
+    <w:rsid w:val="007E3773"/>
     <w:rsid w:val="00815D1D"/>
+    <w:rsid w:val="00921DFA"/>
     <w:rsid w:val="00971898"/>
     <w:rsid w:val="00A42160"/>
+    <w:rsid w:val="00A9464A"/>
     <w:rsid w:val="00BD2D0E"/>
+    <w:rsid w:val="00C20318"/>
     <w:rsid w:val="00D14C93"/>
+    <w:rsid w:val="00D3524D"/>
     <w:rsid w:val="00E969FF"/>
+    <w:rsid w:val="00EB1CF5"/>
+    <w:rsid w:val="00F62854"/>
     <w:rsid w:val="00FC1DDE"/>
   </w:rsids>
   <m:mathPr>
@@ -1300,7 +1742,7 @@
 </file>
 
 <file path=word/glossary/styles.xml><?xml version="1.0" encoding="utf-8"?>
-<w:styles xmlns:mc="http://schemas.openxmlformats.org/markup-compatibility/2006" xmlns:r="http://schemas.openxmlformats.org/officeDocument/2006/relationships" xmlns:w="http://schemas.openxmlformats.org/wordprocessingml/2006/main" xmlns:w14="http://schemas.microsoft.com/office/word/2010/wordml" xmlns:w15="http://schemas.microsoft.com/office/word/2012/wordml" xmlns:w16cex="http://schemas.microsoft.com/office/word/2018/wordml/cex" xmlns:w16cid="http://schemas.microsoft.com/office/word/2016/wordml/cid" xmlns:w16="http://schemas.microsoft.com/office/word/2018/wordml" xmlns:w16du="http://schemas.microsoft.com/office/word/2023/wordml/word16du" xmlns:w16sdtdh="http://schemas.microsoft.com/office/word/2020/wordml/sdtdatahash" xmlns:w16se="http://schemas.microsoft.com/office/word/2015/wordml/symex" mc:Ignorable="w14 w15 w16se w16cid w16 w16cex w16sdtdh w16du">
+<w:styles xmlns:mc="http://schemas.openxmlformats.org/markup-compatibility/2006" xmlns:r="http://schemas.openxmlformats.org/officeDocument/2006/relationships" xmlns:w="http://schemas.openxmlformats.org/wordprocessingml/2006/main" xmlns:w14="http://schemas.microsoft.com/office/word/2010/wordml" xmlns:w15="http://schemas.microsoft.com/office/word/2012/wordml" xmlns:w16cex="http://schemas.microsoft.com/office/word/2018/wordml/cex" xmlns:w16cid="http://schemas.microsoft.com/office/word/2016/wordml/cid" xmlns:w16="http://schemas.microsoft.com/office/word/2018/wordml" xmlns:w16du="http://schemas.microsoft.com/office/word/2023/wordml/word16du" xmlns:w16sdtdh="http://schemas.microsoft.com/office/word/2020/wordml/sdtdatahash" xmlns:w16sdtfl="http://schemas.microsoft.com/office/word/2024/wordml/sdtformatlock" xmlns:w16se="http://schemas.microsoft.com/office/word/2015/wordml/symex" mc:Ignorable="w14 w15 w16se w16cid w16 w16cex w16sdtdh w16sdtfl w16du">
   <w:docDefaults>
     <w:rPrDefault>
       <w:rPr>
@@ -1732,20 +2174,52 @@
     <w:basedOn w:val="Policepardfaut"/>
     <w:uiPriority w:val="99"/>
     <w:semiHidden/>
-    <w:rsid w:val="00533144"/>
-    <w:rPr>
-      <w:color w:val="666666"/>
-    </w:rPr>
+    <w:rsid w:val="00F62854"/>
   </w:style>
   <w:style w:type="paragraph" w:customStyle="1" w:styleId="877DD4951D2744759FB675494371D3E6">
     <w:name w:val="877DD4951D2744759FB675494371D3E6"/>
     <w:rsid w:val="00533144"/>
+  </w:style>
+  <w:style w:type="paragraph" w:customStyle="1" w:styleId="02664BE2408F4CDDA98BEDABF55280A6">
+    <w:name w:val="02664BE2408F4CDDA98BEDABF55280A6"/>
+    <w:rsid w:val="007E3773"/>
+    <w:rPr>
+      <w:lang w:eastAsia="zh-CN"/>
+    </w:rPr>
+  </w:style>
+  <w:style w:type="paragraph" w:customStyle="1" w:styleId="C7567352575E4437A2FF5B6142DA3591">
+    <w:name w:val="C7567352575E4437A2FF5B6142DA3591"/>
+    <w:rsid w:val="00921DFA"/>
+    <w:rPr>
+      <w:lang w:eastAsia="zh-CN"/>
+    </w:rPr>
+  </w:style>
+  <w:style w:type="paragraph" w:customStyle="1" w:styleId="8B4D50695A244D9183DD3067250B2ACA">
+    <w:name w:val="8B4D50695A244D9183DD3067250B2ACA"/>
+    <w:rsid w:val="00F62854"/>
+    <w:rPr>
+      <w:lang w:eastAsia="zh-CN"/>
+    </w:rPr>
+  </w:style>
+  <w:style w:type="paragraph" w:customStyle="1" w:styleId="3E597238980D49F1B0A4C2062C4B8C5D">
+    <w:name w:val="3E597238980D49F1B0A4C2062C4B8C5D"/>
+    <w:rsid w:val="00F62854"/>
+    <w:rPr>
+      <w:lang w:eastAsia="zh-CN"/>
+    </w:rPr>
+  </w:style>
+  <w:style w:type="paragraph" w:customStyle="1" w:styleId="F3E304A877BD4EF5BE2C886476DB4189">
+    <w:name w:val="F3E304A877BD4EF5BE2C886476DB4189"/>
+    <w:rsid w:val="00F62854"/>
+    <w:rPr>
+      <w:lang w:eastAsia="zh-CN"/>
+    </w:rPr>
   </w:style>
 </w:styles>
 </file>
 
 <file path=word/glossary/webSettings.xml><?xml version="1.0" encoding="utf-8"?>
-<w:webSettings xmlns:mc="http://schemas.openxmlformats.org/markup-compatibility/2006" xmlns:r="http://schemas.openxmlformats.org/officeDocument/2006/relationships" xmlns:w="http://schemas.openxmlformats.org/wordprocessingml/2006/main" xmlns:w14="http://schemas.microsoft.com/office/word/2010/wordml" xmlns:w15="http://schemas.microsoft.com/office/word/2012/wordml" xmlns:w16cex="http://schemas.microsoft.com/office/word/2018/wordml/cex" xmlns:w16cid="http://schemas.microsoft.com/office/word/2016/wordml/cid" xmlns:w16="http://schemas.microsoft.com/office/word/2018/wordml" xmlns:w16du="http://schemas.microsoft.com/office/word/2023/wordml/word16du" xmlns:w16sdtdh="http://schemas.microsoft.com/office/word/2020/wordml/sdtdatahash" xmlns:w16se="http://schemas.microsoft.com/office/word/2015/wordml/symex" mc:Ignorable="w14 w15 w16se w16cid w16 w16cex w16sdtdh w16du">
+<w:webSettings xmlns:mc="http://schemas.openxmlformats.org/markup-compatibility/2006" xmlns:r="http://schemas.openxmlformats.org/officeDocument/2006/relationships" xmlns:w="http://schemas.openxmlformats.org/wordprocessingml/2006/main" xmlns:w14="http://schemas.microsoft.com/office/word/2010/wordml" xmlns:w15="http://schemas.microsoft.com/office/word/2012/wordml" xmlns:w16cex="http://schemas.microsoft.com/office/word/2018/wordml/cex" xmlns:w16cid="http://schemas.microsoft.com/office/word/2016/wordml/cid" xmlns:w16="http://schemas.microsoft.com/office/word/2018/wordml" xmlns:w16du="http://schemas.microsoft.com/office/word/2023/wordml/word16du" xmlns:w16sdtdh="http://schemas.microsoft.com/office/word/2020/wordml/sdtdatahash" xmlns:w16sdtfl="http://schemas.microsoft.com/office/word/2024/wordml/sdtformatlock" xmlns:w16se="http://schemas.microsoft.com/office/word/2015/wordml/symex" mc:Ignorable="w14 w15 w16se w16cid w16 w16cex w16sdtdh w16sdtfl w16du">
   <w:optimizeForBrowser/>
   <w:allowPNG/>
 </w:webSettings>

</xml_diff>